<commit_message>
Add closing copyright page to HTML, PDF and Word outputs
Centred logo, navy heading and the Neudata notice in monospace with
normal spacing, matching the PowerPoint and LaTeX templates. Turn off
with copyright-page: false.

Co-Authored-By: Claude Opus 5.5 <noreply@anthropic.com>
</commit_message>
<xml_diff>
--- a/_extensions/neudata/reference.docx
+++ b/_extensions/neudata/reference.docx
@@ -1281,6 +1281,40 @@
       <w:rFonts w:ascii="Segoe UI" w:hAnsi="Segoe UI" w:cs="Segoe UI" w:eastAsia="Segoe UI"/>
       <w:color w:val="04242F"/>
       <w:sz w:val="21"/>
+    </w:rPr>
+  </w:style>
+  <w:style w:type="paragraph" w:customStyle="1" w:styleId="CopyrightLogo">
+    <w:name w:val="Copyright Logo"/>
+    <w:basedOn w:val="Normal"/>
+    <w:pPr>
+      <w:spacing w:before="2400" w:after="480"/>
+      <w:jc w:val="center"/>
+    </w:pPr>
+  </w:style>
+  <w:style w:type="paragraph" w:customStyle="1" w:styleId="CopyrightHeading">
+    <w:name w:val="Copyright Heading"/>
+    <w:basedOn w:val="Normal"/>
+    <w:pPr>
+      <w:keepNext/>
+      <w:spacing w:after="160"/>
+    </w:pPr>
+    <w:rPr>
+      <w:rFonts w:ascii="Segoe UI" w:hAnsi="Segoe UI" w:cs="Segoe UI" w:eastAsia="Segoe UI"/>
+      <w:b/>
+      <w:color w:val="04242F"/>
+      <w:sz w:val="26"/>
+    </w:rPr>
+  </w:style>
+  <w:style w:type="paragraph" w:customStyle="1" w:styleId="CopyrightText">
+    <w:name w:val="Copyright Text"/>
+    <w:basedOn w:val="Normal"/>
+    <w:pPr>
+      <w:spacing w:after="160" w:line="264" w:lineRule="auto"/>
+    </w:pPr>
+    <w:rPr>
+      <w:rFonts w:ascii="Consolas" w:hAnsi="Consolas" w:cs="Consolas" w:eastAsia="Consolas"/>
+      <w:color w:val="1A1A1A"/>
+      <w:sz w:val="18"/>
     </w:rPr>
   </w:style>
 </w:styles>

</xml_diff>